<commit_message>
Added test for insufficient resume text
- Increased text length for resumes other than "sample_short_resume.docx"
</commit_message>
<xml_diff>
--- a/tests/documents/sample_resume.docx
+++ b/tests/documents/sample_resume.docx
@@ -12,7 +12,13 @@
         <w:rPr>
           <w:lang w:val="en-US"/>
         </w:rPr>
-        <w:t>This is my sample resume.</w:t>
+        <w:t>This is my sample resume. This is my sample resume. This is my sample resume. This is my sample resume. This is my sample resume. This is my sample resume. This is my sample resume. This is my sample resume. This is my sample resume. This is my sample resume. This is my sample resume. This is my sample resume. This is my sample resume. This is my sample resume. This is my sample resume.</w:t>
+      </w:r>
+      <w:r>
+        <w:rPr>
+          <w:lang w:val="en-US"/>
+        </w:rPr>
+        <w:t xml:space="preserve"> This is my sample resume. This is my sample resume. This is my sample resume. This is my sample resume. This is my sample resume.</w:t>
       </w:r>
     </w:p>
     <w:sectPr>

</xml_diff>